<commit_message>
fix spacing in resume pdf
</commit_message>
<xml_diff>
--- a/assets/pdf/noah_hamblen_portfolio_resume1.docx
+++ b/assets/pdf/noah_hamblen_portfolio_resume1.docx
@@ -848,6 +848,25 @@
     <w:p>
       <w:pPr>
         <w:pStyle w:val="Default"/>
+        <w:rPr>
+          <w:rFonts w:ascii="Garamond" w:hAnsi="Garamond"/>
+          <w:color w:val="auto"/>
+          <w:sz w:val="22"/>
+          <w:szCs w:val="28"/>
+        </w:rPr>
+      </w:pPr>
+      <w:r>
+        <w:rPr>
+          <w:rFonts w:ascii="Garamond" w:hAnsi="Garamond"/>
+          <w:color w:val="auto"/>
+          <w:sz w:val="22"/>
+          <w:szCs w:val="28"/>
+        </w:rPr>
+      </w:r>
+    </w:p>
+    <w:p>
+      <w:pPr>
+        <w:pStyle w:val="Default"/>
         <w:pBdr>
           <w:bottom w:val="single" w:sz="6" w:space="1" w:color="000000"/>
         </w:pBdr>
@@ -866,18 +885,6 @@
         </w:rPr>
         <w:t>EDUCATION</w:t>
       </w:r>
-    </w:p>
-    <w:p>
-      <w:pPr>
-        <w:pStyle w:val="Default"/>
-        <w:tabs>
-          <w:tab w:val="clear" w:pos="720"/>
-          <w:tab w:val="left" w:pos="1660" w:leader="none"/>
-        </w:tabs>
-        <w:rPr>
-          <w:color w:val="auto"/>
-        </w:rPr>
-      </w:pPr>
       <w:r>
         <w:rPr>
           <w:rFonts w:ascii="Garamond" w:hAnsi="Garamond"/>

</xml_diff>